<commit_message>
Added BodyFieldType and refactored Tab enums; Moved some strings to strings.xml
</commit_message>
<xml_diff>
--- a/shared/src/commonMain/resources/Доверенность.docx
+++ b/shared/src/commonMain/resources/Доверенность.docx
@@ -2457,8 +2457,6 @@
               </w:rPr>
               <w:t>{{</w:t>
             </w:r>
-            <w:bookmarkStart w:id="0" w:name="_GoBack"/>
-            <w:bookmarkEnd w:id="0"/>
             <w:proofErr w:type="spellStart"/>
             <w:r>
               <w:rPr>
@@ -2627,7 +2625,6 @@
                 <w:rFonts w:ascii="Arial" w:hAnsi="Arial" w:cs="Arial"/>
                 <w:sz w:val="12"/>
                 <w:szCs w:val="12"/>
-                <w:lang w:val="en-US"/>
               </w:rPr>
             </w:pPr>
           </w:p>
@@ -2831,7 +2828,7 @@
                 <w:sz w:val="17"/>
                 <w:szCs w:val="17"/>
               </w:rPr>
-              <w:t>Количество (прописью)</w:t>
+              <w:t>Количество</w:t>
             </w:r>
           </w:p>
         </w:tc>
@@ -2954,94 +2951,6 @@
               </w:rPr>
               <w:t>4</w:t>
             </w:r>
-          </w:p>
-        </w:tc>
-      </w:tr>
-      <w:tr>
-        <w:trPr>
-          <w:trHeight w:val="380"/>
-        </w:trPr>
-        <w:tc>
-          <w:tcPr>
-            <w:tcW w:w="993" w:type="dxa"/>
-            <w:tcBorders>
-              <w:left w:val="double" w:sz="4" w:space="0" w:color="auto"/>
-              <w:bottom w:val="double" w:sz="4" w:space="0" w:color="auto"/>
-              <w:right w:val="double" w:sz="4" w:space="0" w:color="auto"/>
-            </w:tcBorders>
-            <w:vAlign w:val="center"/>
-          </w:tcPr>
-          <w:p>
-            <w:pPr>
-              <w:jc w:val="center"/>
-              <w:rPr>
-                <w:rFonts w:ascii="Arial" w:hAnsi="Arial" w:cs="Arial"/>
-                <w:sz w:val="17"/>
-                <w:szCs w:val="17"/>
-              </w:rPr>
-            </w:pPr>
-          </w:p>
-        </w:tc>
-        <w:tc>
-          <w:tcPr>
-            <w:tcW w:w="4819" w:type="dxa"/>
-            <w:tcBorders>
-              <w:left w:val="nil"/>
-              <w:bottom w:val="double" w:sz="4" w:space="0" w:color="auto"/>
-              <w:right w:val="double" w:sz="4" w:space="0" w:color="auto"/>
-            </w:tcBorders>
-            <w:vAlign w:val="center"/>
-          </w:tcPr>
-          <w:p>
-            <w:pPr>
-              <w:rPr>
-                <w:rFonts w:ascii="Arial" w:hAnsi="Arial" w:cs="Arial"/>
-                <w:sz w:val="17"/>
-                <w:szCs w:val="17"/>
-              </w:rPr>
-            </w:pPr>
-          </w:p>
-        </w:tc>
-        <w:tc>
-          <w:tcPr>
-            <w:tcW w:w="1134" w:type="dxa"/>
-            <w:tcBorders>
-              <w:left w:val="nil"/>
-              <w:bottom w:val="double" w:sz="4" w:space="0" w:color="auto"/>
-              <w:right w:val="double" w:sz="4" w:space="0" w:color="auto"/>
-            </w:tcBorders>
-            <w:vAlign w:val="center"/>
-          </w:tcPr>
-          <w:p>
-            <w:pPr>
-              <w:jc w:val="center"/>
-              <w:rPr>
-                <w:rFonts w:ascii="Arial" w:hAnsi="Arial" w:cs="Arial"/>
-                <w:sz w:val="17"/>
-                <w:szCs w:val="17"/>
-              </w:rPr>
-            </w:pPr>
-          </w:p>
-        </w:tc>
-        <w:tc>
-          <w:tcPr>
-            <w:tcW w:w="2552" w:type="dxa"/>
-            <w:tcBorders>
-              <w:left w:val="nil"/>
-              <w:bottom w:val="double" w:sz="4" w:space="0" w:color="auto"/>
-              <w:right w:val="double" w:sz="4" w:space="0" w:color="auto"/>
-            </w:tcBorders>
-            <w:vAlign w:val="center"/>
-          </w:tcPr>
-          <w:p>
-            <w:pPr>
-              <w:jc w:val="center"/>
-              <w:rPr>
-                <w:rFonts w:ascii="Arial" w:hAnsi="Arial" w:cs="Arial"/>
-                <w:sz w:val="17"/>
-                <w:szCs w:val="17"/>
-              </w:rPr>
-            </w:pPr>
           </w:p>
         </w:tc>
       </w:tr>
@@ -3054,6 +2963,8 @@
           <w:szCs w:val="12"/>
         </w:rPr>
       </w:pPr>
+      <w:bookmarkStart w:id="0" w:name="_GoBack"/>
+      <w:bookmarkEnd w:id="0"/>
     </w:p>
     <w:tbl>
       <w:tblPr>

</xml_diff>